<commit_message>
Restore Lessly core flow: save product URLs, 3-day or weekly review reminders, and later purchase decisions
</commit_message>
<xml_diff>
--- a/docs/App-product-requirements.docx
+++ b/docs/App-product-requirements.docx
@@ -12,7 +12,7 @@
     </w:p>
     <w:p>
       <w:r>
-        <w:t>Version 1.1. Prepared for Anas Ayub on 10 October 2026. Lessly is a working name and can be changed before launch.</w:t>
+        <w:t>Version 1.4. Prepared for Anas Ayub on 11 October 2026. Lessly is a working name and can be changed before launch.</w:t>
       </w:r>
     </w:p>
     <w:p>
@@ -25,7 +25,7 @@
     </w:p>
     <w:p>
       <w:r>
-        <w:t>Build a mobile app that helps people buy fewer discretionary things through a useful pause, realistic personal rules and practical alternatives. The first release should work without a bank connection or mandatory account. Keep the core experience simple enough for one developer to build, support and improve.</w:t>
+        <w:t>Build a mobile app whose core loop is saving a product link, waiting for a chosen reminder date, and deciding later whether the item is still wanted. A useful pause, realistic personal rules and practical alternatives support that loop. The first release should work without a bank connection or mandatory account. Keep the core experience simple enough for one developer to build, support and improve.</w:t>
       </w:r>
     </w:p>
     <w:p>
@@ -71,7 +71,7 @@
     </w:p>
     <w:p>
       <w:r>
-        <w:t>The current brand uses forest green, pale mint, warm clay and cream. Georgia headings provide warmth; a clear sans serif supports controls and numbers. Original clay hourglass and garden illustrations communicate pause and growth. Motion remains restrained and can be disabled through reduced-motion preferences. The final name, legal identity, pricing and store assets remain undecided.</w:t>
+        <w:t>The current brand uses forest green, pale mint, warm clay and cream. Bold system-sans headings make screens easy to scan; selective Georgia italic accents add warmth. Seven original clay illustrations explain reflection, recovery, existing belongings, goals and everyday enjoyment. A persistent motion setting and the system reduced-motion preference control decorative animation. The final name, legal identity, pricing and store assets remain undecided.</w:t>
       </w:r>
     </w:p>
     <w:p>
@@ -141,17 +141,27 @@
         <w:pStyle w:val="Heading2"/>
       </w:pPr>
       <w:r>
-        <w:t>Waiting room and real cooldowns</w:t>
+        <w:t>Saving a product and deciding after a reminder</w:t>
       </w:r>
     </w:p>
     <w:p>
       <w:r>
-        <w:t>Capture a want with price, category, personal context and a waiting period. The user can edit, remove, wait longer, skip or log a purchase. Use a stored expiration timestamp rather than a decrementing counter that resets on restart. When time expires, invite reflection rather than encouraging checkout.</w:t>
+        <w:t>The core flow begins with a product the user saw and wants to buy. They paste its optional shop URL, enter a name, price and category, and choose when to revisit it. Three days and one week are prominent choices; 24 and 48 hours remain available. A per-product reminder preference defaults on in the save form. The app saves the original link and a review date, then invites the user to leave the decision for later.</w:t>
       </w:r>
     </w:p>
     <w:p>
       <w:r>
-        <w:t>Acceptance: removing an entry adds no skipped spending. Explicitly skipping it adds its price once and removes it. Extending a wait sets a new expiration. Cooldown status is recalculated from the timestamp when the prototype renders. Add retailer URLs or product-photo imports only after evaluating whether they increase temptation.</w:t>
+        <w:t>The saved-product screen shows the link, local review date, remaining time, reminder preference and optional context. The user can update the URL without resetting the wait or explicitly choose a new interval. At expiry, Today and the waiting room expose the item as ready to revisit. The user can decide they no longer want it, review before buying intentionally, or wait another three days or week. Opening a product link does not log a purchase or change money totals.</w:t>
+      </w:r>
+    </w:p>
+    <w:p>
+      <w:r>
+        <w:t>Acceptance: persist a stable item ID, safe http/https product URL, creation time, selected interval, review timestamp and reminder preference. Reject unsafe schemes and links containing credentials; escape displayed values. Use the saved expiration timestamp rather than a restarting counter. Editing with Keep current review date preserves it; rescheduling sets a new one. Reminder-off items still become ready at expiry. Removing an entry adds no skipped spending. Explicitly skipping it adds its price once and removes it. Waiting and link opening do not increase savings or goal contributions.</w:t>
+      </w:r>
+    </w:p>
+    <w:p>
+      <w:r>
+        <w:t>The browser prototype saves links, dates and preferences, recalculates due items on rendering and provides the in-app review entry. It does not send device notifications while closed. Scheduled device reminders are a first-release requirement for the native app, rather than an optional later feature. They should use local notification scheduling without requiring a bank connection, an account or a server. Request notification permission after the user chooses a reminder; show a clear status if permission is denied. Tap a reminder to open the same saved-product review. Update or cancel the schedule when the item is rescheduled, skipped, deleted or logged as purchased. Test duplicate prevention, background delivery, app restart, timezone changes and daylight saving transitions before release. Optional product-photo imports can follow validation; the manually entered link is part of the core release.</w:t>
       </w:r>
     </w:p>
     <w:p>
@@ -1491,7 +1501,7 @@
                 <w:color w:val="000000"/>
                 <w:sz w:val="20"/>
               </w:rPr>
-              <w:t>Stable ID, name, category ID, price/currency where relevant, created time, cooldown expiry, condition, use status and remaining estimate</w:t>
+              <w:t>Stable ID, name, category ID, price/currency where relevant, created time, product URL, review interval, expiry timestamp, reminder preference, condition, use status and remaining estimate</w:t>
             </w:r>
           </w:p>
         </w:tc>
@@ -2676,12 +2686,12 @@
     </w:p>
     <w:p>
       <w:r>
-        <w:t>For the first native release, prioritize challenges, timestamp-based wants, the pause, suitable inventory, exception reflection, contextual purchases, check-ins and manual goals. Add the seven-day start and a simple activity menu to keep the product easy to begin. Ship category pockets and use-up progress next if early users find them useful. Keep the larger tools optional; do not make every user maintain a financial dashboard.</w:t>
+        <w:t>For the first native release, prioritize challenges, timestamp-based wants with product URLs and scheduled local reminders, the pause, suitable inventory, exception reflection, contextual purchases, check-ins and manual goals. Add the seven-day start and a simple activity menu to keep the product easy to begin. Ship category pockets and use-up progress next if early users find them useful. Keep the larger tools optional; do not make every user maintain a financial dashboard.</w:t>
       </w:r>
     </w:p>
     <w:p>
       <w:r>
-        <w:t>After the core is reliable, consider production analytics, photo capture, scheduled reminders and backup. Buddy sync and paid upgrades should follow demonstrated demand and a privacy design. Avoid bank integrations, retailer scraping, a public social feed or costly AI infrastructure in the initial release.</w:t>
+        <w:t>After the core is reliable, consider production analytics, photo capture and backup. Buddy sync and paid upgrades should follow demonstrated demand and a privacy design. Avoid bank integrations, retailer scraping, a public social feed or costly AI infrastructure in the initial release.</w:t>
       </w:r>
     </w:p>
     <w:p>
@@ -2712,7 +2722,7 @@
     </w:p>
     <w:p>
       <w:r>
-        <w:t>The current regression checks cover all screen renders and navigation, form validation, escaped input, timer lifecycle, timestamp cooldowns, independent monetary totals, goal contributions, preserved check-ins, essential exceptions, activities, food plans, unsuitable-inventory exclusion, carry-over, cancellation confirmation, commitments and refunds. Run npm test or node tests/prototype.test.cjs.</w:t>
+        <w:t>The current regression checks cover all screen renders and navigation, form validation, escaped input, timer lifecycle, timestamp cooldowns, independent monetary totals, goal contributions, preserved check-ins, essential exceptions, activities, food plans, unsuitable-inventory exclusion, carry-over, cancellation confirmation, commitments and refunds. The v1.4 checks also cover safe URL capture, three-day and one-week intervals, preservation of review dates on edit, rescheduling, due-item review and snoozing without financial changes. Run npm test or node tests/prototype.test.cjs.</w:t>
       </w:r>
     </w:p>
     <w:p>
@@ -2766,7 +2776,7 @@
         <w:color w:val="000000"/>
         <w:sz w:val="16"/>
       </w:rPr>
-      <w:t xml:space="preserve">Lessly product requirements 1.1  |  </w:t>
+      <w:t xml:space="preserve">Lessly product requirements 1.4  |  </w:t>
     </w:r>
     <w:fldSimple w:instr="PAGE"/>
   </w:p>

</xml_diff>

<commit_message>
Redesign Lessly around animated companion, product cooldowns and private anti-haul sharing
</commit_message>
<xml_diff>
--- a/docs/App-product-requirements.docx
+++ b/docs/App-product-requirements.docx
@@ -12,7 +12,7 @@
     </w:p>
     <w:p>
       <w:r>
-        <w:t>Version 1.4. Prepared for Anas Ayub on 11 October 2026. Lessly is a working name and can be changed before launch.</w:t>
+        <w:t>Version 1.5. Prepared for Anas Ayub on 13 October 2026. Lessly is a working name and can be changed before launch.</w:t>
       </w:r>
     </w:p>
     <w:p>
@@ -30,7 +30,7 @@
     </w:p>
     <w:p>
       <w:r>
-        <w:t>The prototype contains 82 navigable screens. It combines a no-buy or low-buy challenge with an impulse pause, a waiting room, an owned-item collection and meaningful goals. Community-informed tools add essential replacement decisions, personal activities, use-up tracking, food-delivery alternatives and contextual spending records. The implementation is an interactive browser-local prototype; the native app and external services are a subsequent phase.</w:t>
+        <w:t>The prototype contains 90 navigable screens. It combines a no-buy or low-buy challenge with an impulse pause, a waiting room, an owned-item collection and meaningful goals. Community-informed tools add essential replacement decisions, personal activities, use-up tracking, food-delivery alternatives and contextual spending records. The implementation is an interactive browser-local prototype; the native app and external services are a subsequent phase.</w:t>
       </w:r>
     </w:p>
     <w:p>
@@ -522,6 +522,109 @@
     <w:p>
       <w:r>
         <w:t>Acceptance: export includes local records; reset requires a second deliberate action. No notification delivery, live sync service or installed offline cache is connected. Browser storage can be cleared by the browser, so it is not a production backup solution.</w:t>
+      </w:r>
+    </w:p>
+    <w:p>
+      <w:pPr>
+        <w:pStyle w:val="Heading1"/>
+      </w:pPr>
+      <w:r>
+        <w:t>Shopping detox experience</w:t>
+      </w:r>
+    </w:p>
+    <w:p>
+      <w:r>
+        <w:t>Version 1.5 makes the product waiting loop the primary visual experience. Today presents an animated sprout, parked temptations, products ready to review and a direct product capture action. The waiting room uses object cards with a visible cooldown and the optional price in work hours. The original product URL, three-day or one-week deadline and buy, skip or wait-longer decisions remain central.</w:t>
+      </w:r>
+    </w:p>
+    <w:p>
+      <w:pPr>
+        <w:pStyle w:val="Heading2"/>
+      </w:pPr>
+      <w:r>
+        <w:t>Companion growth</w:t>
+      </w:r>
+    </w:p>
+    <w:p>
+      <w:r>
+        <w:t>A code-native sprout illustration breathes, blinks and waves. Growth has three stages at zero, four and twelve thoughtful moments. A moment is an explicitly recorded product decision, a daily check-in or a recorded pause. Capturing more wants earns no growth. An essential or unplanned purchase does not subtract progress. Native implementation should deduplicate event IDs, preserve history across versions and expose the same reduced-motion behavior.</w:t>
+      </w:r>
+    </w:p>
+    <w:p>
+      <w:r>
+        <w:t>Acceptance: only one product decision is recorded per item ID; a daily check-in can be updated without earning duplicate credit. All animation stops with the app motion control or system reduced-motion setting, while the pause timer and stored records keep working.</w:t>
+      </w:r>
+    </w:p>
+    <w:p>
+      <w:pPr>
+        <w:pStyle w:val="Heading2"/>
+      </w:pPr>
+      <w:r>
+        <w:t>Temptation counter and anti haul</w:t>
+      </w:r>
+    </w:p>
+    <w:p>
+      <w:r>
+        <w:t>Parked value is the sum of undecided saved-product prices. It is not avoided spending. Recorded skipped value sums explicit skips with item history, filtered to the current local calendar month or all recorded history. The earlier prototype aggregate remains visible separately; it includes demo data and has no complete item-level history. New monthly anti-hauls and share cards exclude that earlier total. Set-aside balances continue to require a separate user confirmation.</w:t>
+      </w:r>
+    </w:p>
+    <w:p>
+      <w:r>
+        <w:t>Acceptance: deleting, waiting longer, editing a product link or opening a shop changes no skipped value. Explicit skipping counts once, preserves money set aside and stores the item's name, category, price, date and stable ID. Production monetary aggregation must retain original currency and use minor units; changing prototype currency relabels values without conversion.</w:t>
+      </w:r>
+    </w:p>
+    <w:p>
+      <w:pPr>
+        <w:pStyle w:val="Heading2"/>
+      </w:pPr>
+      <w:r>
+        <w:t>Product sharing</w:t>
+      </w:r>
+    </w:p>
+    <w:p>
+      <w:r>
+        <w:t>The prototype includes a native share-sheet design and a working browser paste action. Clipboard denial falls back to the existing product-link field. An incoming URL query can prefill a safe http or https product link and optional title, with manual confirmation of price and reminder. Importing does not save the product or create an assumed retailer price.</w:t>
+      </w:r>
+    </w:p>
+    <w:p>
+      <w:r>
+        <w:t>Acceptance: reject unsafe URL schemes, credential-bearing URLs and invalid links. Escape titles. Shipping iOS requires a Share Extension and shared app storage; Android requires an incoming share intent. Actual native integration, metadata extraction and background notifications are not connected in this browser prototype.</w:t>
+      </w:r>
+    </w:p>
+    <w:p>
+      <w:pPr>
+        <w:pStyle w:val="Heading2"/>
+      </w:pPr>
+      <w:r>
+        <w:t>No Buy Battles</w:t>
+      </w:r>
+    </w:p>
+    <w:p>
+      <w:r>
+        <w:t>A local room supports seven-day and thirty-day durations, one focus category, personal rules and essential exceptions. A participant records one check-in per local calendar day. Following a plan, a necessary exception and an honest setback all count toward completion. Score is check-in days divided by challenge duration, rather than money avoided or purchases made. The opponent and its score are explicitly illustrative. A live recap does not pretend an unfinished challenge is complete.</w:t>
+      </w:r>
+    </w:p>
+    <w:p>
+      <w:r>
+        <w:t>Acceptance: edits replace today's check-in; entries after the challenge period are rejected. Creating another room replaces the current local room without erasing product decisions or companion progress. Copying an invitation draft sends nothing and creates no working join link. Production requires authentication, consented membership, timezone rules, authorized reads and writes, revocation and sync. Prices, product URLs, notes and financial balances remain private.</w:t>
+      </w:r>
+    </w:p>
+    <w:p>
+      <w:pPr>
+        <w:pStyle w:val="Heading2"/>
+      </w:pPr>
+      <w:r>
+        <w:t>Share cards</w:t>
+      </w:r>
+    </w:p>
+    <w:p>
+      <w:r>
+        <w:t>Forest and clay card styles download as self-contained SVG. Amounts are hidden by default. Only recorded monthly skips appear in the count and optional amount. The card labels estimated purchase cost clearly and excludes actual savings, product names, links and personal notes. Captions use the same privacy settings and fall back to a text download when clipboard access is unavailable.</w:t>
+      </w:r>
+    </w:p>
+    <w:p>
+      <w:r>
+        <w:t>Acceptance: the card and caption use the same selected period and records. Earlier aggregate totals never leak into a share card. Zero records produce a truthful zero state, not an invented streak. The design uses the working tagline Want it Wait on it; final brand wording can change independently of financial definitions.</w:t>
       </w:r>
     </w:p>
     <w:p>
@@ -2036,7 +2139,7 @@
                 <w:color w:val="000000"/>
                 <w:sz w:val="20"/>
               </w:rPr>
-              <w:t>82 screens, original assets, responsive review site and motion</w:t>
+              <w:t>90 screens, original assets, responsive review site and motion</w:t>
             </w:r>
           </w:p>
         </w:tc>
@@ -2776,7 +2879,7 @@
         <w:color w:val="000000"/>
         <w:sz w:val="16"/>
       </w:rPr>
-      <w:t xml:space="preserve">Lessly product requirements 1.4  |  </w:t>
+      <w:t xml:space="preserve">Lessly product requirements 1.5  |  </w:t>
     </w:r>
     <w:fldSimple w:instr="PAGE"/>
   </w:p>

</xml_diff>